<commit_message>
Add HR job titles and contract placeholders
</commit_message>
<xml_diff>
--- a/templates/contracts/kontrate-me-afat-te-pacaktuar.docx
+++ b/templates/contracts/kontrate-me-afat-te-pacaktuar.docx
@@ -2418,199 +2418,7 @@
         </w:rPr>
       </w:pPr>
       <w:r>
-        <w:t xml:space="preserve">Puna </w:t>
-      </w:r>
-      <w:proofErr w:type="spellStart"/>
-      <w:r>
-        <w:t>provuese</w:t>
-      </w:r>
-      <w:proofErr w:type="spellEnd"/>
-      <w:r>
-        <w:t xml:space="preserve"> e </w:t>
-      </w:r>
-      <w:proofErr w:type="spellStart"/>
-      <w:r>
-        <w:t>të</w:t>
-      </w:r>
-      <w:proofErr w:type="spellEnd"/>
-      <w:r>
-        <w:t xml:space="preserve"> </w:t>
-      </w:r>
-      <w:proofErr w:type="spellStart"/>
-      <w:r>
-        <w:t>punësuarit</w:t>
-      </w:r>
-      <w:proofErr w:type="spellEnd"/>
-      <w:r>
-        <w:t xml:space="preserve"> </w:t>
-      </w:r>
-      <w:proofErr w:type="spellStart"/>
-      <w:r>
-        <w:t>zgjat</w:t>
-      </w:r>
-      <w:proofErr w:type="spellEnd"/>
-      <w:r>
-        <w:t xml:space="preserve"> </w:t>
-      </w:r>
-      <w:proofErr w:type="spellStart"/>
-      <w:r>
-        <w:t>deri</w:t>
-      </w:r>
-      <w:proofErr w:type="spellEnd"/>
-      <w:r>
-        <w:t xml:space="preserve"> </w:t>
-      </w:r>
-      <w:proofErr w:type="spellStart"/>
-      <w:r>
-        <w:t>më</w:t>
-      </w:r>
-      <w:proofErr w:type="spellEnd"/>
-      <w:r>
-        <w:t xml:space="preserve">: _____________. </w:t>
-      </w:r>
-      <w:proofErr w:type="spellStart"/>
-      <w:r>
-        <w:t>Gjatë</w:t>
-      </w:r>
-      <w:proofErr w:type="spellEnd"/>
-      <w:r>
-        <w:t xml:space="preserve"> </w:t>
-      </w:r>
-      <w:proofErr w:type="spellStart"/>
-      <w:r>
-        <w:t>periudhës</w:t>
-      </w:r>
-      <w:proofErr w:type="spellEnd"/>
-      <w:r>
-        <w:t xml:space="preserve"> </w:t>
-      </w:r>
-      <w:proofErr w:type="spellStart"/>
-      <w:r>
-        <w:t>provuese</w:t>
-      </w:r>
-      <w:proofErr w:type="spellEnd"/>
-      <w:r>
-        <w:t xml:space="preserve"> </w:t>
-      </w:r>
-      <w:proofErr w:type="spellStart"/>
-      <w:r>
-        <w:t>të</w:t>
-      </w:r>
-      <w:proofErr w:type="spellEnd"/>
-      <w:r>
-        <w:t xml:space="preserve"> </w:t>
-      </w:r>
-      <w:proofErr w:type="spellStart"/>
-      <w:r>
-        <w:t>punës</w:t>
-      </w:r>
-      <w:proofErr w:type="spellEnd"/>
-      <w:r>
-        <w:t xml:space="preserve">, </w:t>
-      </w:r>
-      <w:proofErr w:type="spellStart"/>
-      <w:r>
-        <w:t>punëdhënësi</w:t>
-      </w:r>
-      <w:proofErr w:type="spellEnd"/>
-      <w:r>
-        <w:t xml:space="preserve"> </w:t>
-      </w:r>
-      <w:proofErr w:type="spellStart"/>
-      <w:r>
-        <w:t>dhe</w:t>
-      </w:r>
-      <w:proofErr w:type="spellEnd"/>
-      <w:r>
-        <w:t xml:space="preserve"> </w:t>
-      </w:r>
-      <w:proofErr w:type="spellStart"/>
-      <w:r>
-        <w:t>i</w:t>
-      </w:r>
-      <w:proofErr w:type="spellEnd"/>
-      <w:r>
-        <w:t xml:space="preserve"> </w:t>
-      </w:r>
-      <w:proofErr w:type="spellStart"/>
-      <w:r>
-        <w:t>punësuari</w:t>
-      </w:r>
-      <w:proofErr w:type="spellEnd"/>
-      <w:r>
-        <w:t xml:space="preserve">, </w:t>
-      </w:r>
-      <w:proofErr w:type="spellStart"/>
-      <w:r>
-        <w:t>mund</w:t>
-      </w:r>
-      <w:proofErr w:type="spellEnd"/>
-      <w:r>
-        <w:t xml:space="preserve"> ta </w:t>
-      </w:r>
-      <w:proofErr w:type="spellStart"/>
-      <w:r>
-        <w:t>ndërpresin</w:t>
-      </w:r>
-      <w:proofErr w:type="spellEnd"/>
-      <w:r>
-        <w:t xml:space="preserve"> </w:t>
-      </w:r>
-      <w:proofErr w:type="spellStart"/>
-      <w:r>
-        <w:t>marrëdhënien</w:t>
-      </w:r>
-      <w:proofErr w:type="spellEnd"/>
-      <w:r>
-        <w:t xml:space="preserve"> e </w:t>
-      </w:r>
-      <w:proofErr w:type="spellStart"/>
-      <w:r>
-        <w:t>punës</w:t>
-      </w:r>
-      <w:proofErr w:type="spellEnd"/>
-      <w:r>
-        <w:t xml:space="preserve">, me </w:t>
-      </w:r>
-      <w:proofErr w:type="spellStart"/>
-      <w:r>
-        <w:t>njoftim</w:t>
-      </w:r>
-      <w:proofErr w:type="spellEnd"/>
-      <w:r>
-        <w:t xml:space="preserve"> </w:t>
-      </w:r>
-      <w:proofErr w:type="spellStart"/>
-      <w:r>
-        <w:t>paraprak</w:t>
-      </w:r>
-      <w:proofErr w:type="spellEnd"/>
-      <w:r>
-        <w:t xml:space="preserve"> </w:t>
-      </w:r>
-      <w:proofErr w:type="spellStart"/>
-      <w:r>
-        <w:t>prej</w:t>
-      </w:r>
-      <w:proofErr w:type="spellEnd"/>
-      <w:r>
-        <w:t xml:space="preserve"> </w:t>
-      </w:r>
-      <w:proofErr w:type="spellStart"/>
-      <w:r>
-        <w:t>shtatë</w:t>
-      </w:r>
-      <w:proofErr w:type="spellEnd"/>
-      <w:r>
-        <w:t xml:space="preserve"> (7) </w:t>
-      </w:r>
-      <w:proofErr w:type="spellStart"/>
-      <w:r>
-        <w:t>ditësh</w:t>
-      </w:r>
-      <w:proofErr w:type="spellEnd"/>
-      <w:r>
-        <w:t>.</w:t>
+        <w:t>Puna provuese e të punësuarit zgjat: _____________. Gjatë periudhës provuese të punës, punëdhënësi dhe i punësuari, mund ta ndërpresin marrëdhënien e punës, me njoftim paraprak prej shtatë (7) ditësh.</w:t>
       </w:r>
     </w:p>
     <w:p>

</xml_diff>